<commit_message>
resume: add portfolio repository link
</commit_message>
<xml_diff>
--- a/resume/许云翔-游戏AI策划-简历.docx
+++ b/resume/许云翔-游戏AI策划-简历.docx
@@ -142,6 +142,20 @@
     </w:p>
     <w:p>
       <w:pPr>
+        <w:spacing w:before="0" w:after="40" w:line="225" w:lineRule="auto"/>
+      </w:pPr>
+      <w:r>
+        <w:rPr>
+          <w:rFonts w:ascii="等线" w:hAnsi="等线" w:eastAsia="等线" w:cs="等线"/>
+          <w:sz w:val="16"/>
+          <w:szCs w:val="16"/>
+          <w:color w:val="595959"/>
+        </w:rPr>
+        <w:t xml:space="preserve">作品集　github.com/White7x-Work/game-design-portfolio</w:t>
+      </w:r>
+    </w:p>
+    <w:p>
+      <w:pPr>
         <w:spacing w:before="110" w:after="30" w:line="225" w:lineRule="auto"/>
         <w:pBdr>
           <w:bottom w:val="single" w:sz="6" w:space="1" w:color="BFBFBF"/>

</xml_diff>